<commit_message>
Added a invoice id in fs_payment receipt
</commit_message>
<xml_diff>
--- a/FS_Receivable_PaymentReceipt.docx
+++ b/FS_Receivable_PaymentReceipt.docx
@@ -1,6 +1,6 @@
 
 <file path=word/document.xml><?xml version="1.0" encoding="utf-8"?>
-<w:document xmlns:a="http://schemas.openxmlformats.org/drawingml/2006/main" xmlns:pic="http://schemas.openxmlformats.org/drawingml/2006/picture" xmlns:wpc="http://schemas.microsoft.com/office/word/2010/wordprocessingCanvas" xmlns:cx="http://schemas.microsoft.com/office/drawing/2014/chartex" xmlns:cx1="http://schemas.microsoft.com/office/drawing/2015/9/8/chartex" xmlns:cx2="http://schemas.microsoft.com/office/drawing/2015/10/21/chartex" xmlns:cx3="http://schemas.microsoft.com/office/drawing/2016/5/9/chartex" xmlns:cx4="http://schemas.microsoft.com/office/drawing/2016/5/10/chartex" xmlns:cx5="http://schemas.microsoft.com/office/drawing/2016/5/11/chartex" xmlns:cx6="http://schemas.microsoft.com/office/drawing/2016/5/12/chartex" xmlns:cx7="http://schemas.microsoft.com/office/drawing/2016/5/13/chartex" xmlns:cx8="http://schemas.microsoft.com/office/drawing/2016/5/14/chartex" xmlns:mc="http://schemas.openxmlformats.org/markup-compatibility/2006" xmlns:aink="http://schemas.microsoft.com/office/drawing/2016/ink" xmlns:am3d="http://schemas.microsoft.com/office/drawing/2017/model3d" xmlns:o="urn:schemas-microsoft-com:office:office" xmlns:oel="http://schemas.microsoft.com/office/2019/extlst" xmlns:r="http://schemas.openxmlformats.org/officeDocument/2006/relationships" xmlns:m="http://schemas.openxmlformats.org/officeDocument/2006/math" xmlns:v="urn:schemas-microsoft-com:vml" xmlns:wp14="http://schemas.microsoft.com/office/word/2010/wordprocessingDrawing" xmlns:wp="http://schemas.openxmlformats.org/drawingml/2006/wordprocessingDrawing" xmlns:w10="urn:schemas-microsoft-com:office:word" xmlns:w="http://schemas.openxmlformats.org/wordprocessingml/2006/main" xmlns:w14="http://schemas.microsoft.com/office/word/2010/wordml" xmlns:w15="http://schemas.microsoft.com/office/word/2012/wordml" xmlns:w16cex="http://schemas.microsoft.com/office/word/2018/wordml/cex" xmlns:w16cid="http://schemas.microsoft.com/office/word/2016/wordml/cid" xmlns:w16="http://schemas.microsoft.com/office/word/2018/wordml" xmlns:w16du="http://schemas.microsoft.com/office/word/2023/wordml/word16du" xmlns:w16sdtdh="http://schemas.microsoft.com/office/word/2020/wordml/sdtdatahash" xmlns:w16se="http://schemas.microsoft.com/office/word/2015/wordml/symex" xmlns:wpg="http://schemas.microsoft.com/office/word/2010/wordprocessingGroup" xmlns:wpi="http://schemas.microsoft.com/office/word/2010/wordprocessingInk" xmlns:wne="http://schemas.microsoft.com/office/word/2006/wordml" xmlns:wps="http://schemas.microsoft.com/office/word/2010/wordprocessingShape" mc:Ignorable="w14 w15 w16se w16cid w16 w16cex w16sdtdh w16du wp14">
+<w:document xmlns:wpc="http://schemas.microsoft.com/office/word/2010/wordprocessingCanvas" xmlns:cx="http://schemas.microsoft.com/office/drawing/2014/chartex" xmlns:cx1="http://schemas.microsoft.com/office/drawing/2015/9/8/chartex" xmlns:cx2="http://schemas.microsoft.com/office/drawing/2015/10/21/chartex" xmlns:cx3="http://schemas.microsoft.com/office/drawing/2016/5/9/chartex" xmlns:cx4="http://schemas.microsoft.com/office/drawing/2016/5/10/chartex" xmlns:cx5="http://schemas.microsoft.com/office/drawing/2016/5/11/chartex" xmlns:cx6="http://schemas.microsoft.com/office/drawing/2016/5/12/chartex" xmlns:cx7="http://schemas.microsoft.com/office/drawing/2016/5/13/chartex" xmlns:cx8="http://schemas.microsoft.com/office/drawing/2016/5/14/chartex" xmlns:mc="http://schemas.openxmlformats.org/markup-compatibility/2006" xmlns:aink="http://schemas.microsoft.com/office/drawing/2016/ink" xmlns:am3d="http://schemas.microsoft.com/office/drawing/2017/model3d" xmlns:o="urn:schemas-microsoft-com:office:office" xmlns:oel="http://schemas.microsoft.com/office/2019/extlst" xmlns:r="http://schemas.openxmlformats.org/officeDocument/2006/relationships" xmlns:m="http://schemas.openxmlformats.org/officeDocument/2006/math" xmlns:v="urn:schemas-microsoft-com:vml" xmlns:wp14="http://schemas.microsoft.com/office/word/2010/wordprocessingDrawing" xmlns:wp="http://schemas.openxmlformats.org/drawingml/2006/wordprocessingDrawing" xmlns:w10="urn:schemas-microsoft-com:office:word" xmlns:w="http://schemas.openxmlformats.org/wordprocessingml/2006/main" xmlns:w14="http://schemas.microsoft.com/office/word/2010/wordml" xmlns:w15="http://schemas.microsoft.com/office/word/2012/wordml" xmlns:w16cex="http://schemas.microsoft.com/office/word/2018/wordml/cex" xmlns:w16cid="http://schemas.microsoft.com/office/word/2016/wordml/cid" xmlns:w16="http://schemas.microsoft.com/office/word/2018/wordml" xmlns:w16du="http://schemas.microsoft.com/office/word/2023/wordml/word16du" xmlns:w16sdtdh="http://schemas.microsoft.com/office/word/2020/wordml/sdtdatahash" xmlns:w16se="http://schemas.microsoft.com/office/word/2015/wordml/symex" xmlns:wpg="http://schemas.microsoft.com/office/word/2010/wordprocessingGroup" xmlns:wpi="http://schemas.microsoft.com/office/word/2010/wordprocessingInk" xmlns:wne="http://schemas.microsoft.com/office/word/2006/wordml" xmlns:wps="http://schemas.microsoft.com/office/word/2010/wordprocessingShape" mc:Ignorable="w14 w15 w16se w16cid w16 w16cex w16sdtdh w16du wp14">
   <w:body>
     <w:tbl>
       <w:tblPr>
@@ -21,10 +21,10 @@
           <w:tcPr>
             <w:tcW w:w="13466" w:type="dxa"/>
             <w:tcBorders>
-              <w:top w:val="single" w:color="auto" w:sz="12" w:space="0"/>
-              <w:left w:val="single" w:color="auto" w:sz="12" w:space="0"/>
-              <w:bottom w:val="single" w:color="auto" w:sz="12" w:space="0"/>
-              <w:right w:val="single" w:color="auto" w:sz="12" w:space="0"/>
+              <w:top w:val="single" w:sz="12" w:space="0" w:color="auto"/>
+              <w:left w:val="single" w:sz="12" w:space="0" w:color="auto"/>
+              <w:bottom w:val="single" w:sz="12" w:space="0" w:color="auto"/>
+              <w:right w:val="single" w:sz="12" w:space="0" w:color="auto"/>
             </w:tcBorders>
           </w:tcPr>
           <w:tbl>
@@ -172,7 +172,7 @@
                         <w:top w:val="nil"/>
                         <w:left w:val="nil"/>
                         <w:bottom w:val="nil"/>
-                        <w:right w:val="single" w:color="auto" w:sz="4" w:space="0"/>
+                        <w:right w:val="single" w:sz="4" w:space="0" w:color="auto"/>
                       </w:tcBorders>
                     </w:tcPr>
                     <w:p>
@@ -184,9 +184,9 @@
                           <w:noProof/>
                         </w:rPr>
                         <w:drawing>
-                          <wp:inline distT="0" distB="0" distL="0" distR="0" wp14:anchorId="6B5B9CA2" wp14:editId="49C7900D">
-                            <wp:extent cx="891540" cy="891540"/>
-                            <wp:effectExtent l="0" t="0" r="3810" b="3810"/>
+                          <wp:inline distT="0" distB="0" distL="0" distR="0" wp14:anchorId="6B5B9CA2" wp14:editId="7CEA949C">
+                            <wp:extent cx="2773680" cy="891540"/>
+                            <wp:effectExtent l="0" t="0" r="7620" b="3810"/>
                             <wp:docPr id="1" name="Picture 1"/>
                             <wp:cNvGraphicFramePr>
                               <a:graphicFrameLocks xmlns:a="http://schemas.openxmlformats.org/drawingml/2006/main" noChangeAspect="1"/>
@@ -209,7 +209,7 @@
                                   <pic:spPr bwMode="auto">
                                     <a:xfrm>
                                       <a:off x="0" y="0"/>
-                                      <a:ext cx="891540" cy="891540"/>
+                                      <a:ext cx="2773680" cy="891540"/>
                                     </a:xfrm>
                                     <a:prstGeom prst="rect">
                                       <a:avLst/>
@@ -314,7 +314,7 @@
                     <w:top w:val="nil"/>
                     <w:left w:val="nil"/>
                     <w:bottom w:val="nil"/>
-                    <w:right w:val="single" w:color="auto" w:sz="4" w:space="0"/>
+                    <w:right w:val="single" w:sz="4" w:space="0" w:color="auto"/>
                   </w:tcBorders>
                 </w:tcPr>
                 <w:p/>
@@ -365,7 +365,7 @@
                     <w:top w:val="nil"/>
                     <w:left w:val="nil"/>
                     <w:bottom w:val="nil"/>
-                    <w:right w:val="single" w:color="auto" w:sz="4" w:space="0"/>
+                    <w:right w:val="single" w:sz="4" w:space="0" w:color="auto"/>
                   </w:tcBorders>
                 </w:tcPr>
                 <w:p/>
@@ -416,7 +416,7 @@
                     <w:top w:val="nil"/>
                     <w:left w:val="nil"/>
                     <w:bottom w:val="nil"/>
-                    <w:right w:val="single" w:color="auto" w:sz="4" w:space="0"/>
+                    <w:right w:val="single" w:sz="4" w:space="0" w:color="auto"/>
                   </w:tcBorders>
                 </w:tcPr>
                 <w:p/>
@@ -470,7 +470,7 @@
                     <w:top w:val="nil"/>
                     <w:left w:val="nil"/>
                     <w:bottom w:val="nil"/>
-                    <w:right w:val="single" w:color="auto" w:sz="4" w:space="0"/>
+                    <w:right w:val="single" w:sz="4" w:space="0" w:color="auto"/>
                   </w:tcBorders>
                 </w:tcPr>
                 <w:p/>
@@ -511,7 +511,7 @@
                   <w:gridSpan w:val="5"/>
                   <w:tcBorders>
                     <w:top w:val="nil"/>
-                    <w:bottom w:val="single" w:color="auto" w:sz="4" w:space="0"/>
+                    <w:bottom w:val="single" w:sz="4" w:space="0" w:color="auto"/>
                   </w:tcBorders>
                 </w:tcPr>
                 <w:p>
@@ -1126,20 +1126,37 @@
               <w:trPr>
                 <w:trHeight w:val="250"/>
               </w:trPr>
-              <w:tc>
-                <w:tcPr>
-                  <w:tcW w:w="3114" w:type="dxa"/>
-                  <w:shd w:val="clear" w:color="auto" w:fill="auto"/>
-                </w:tcPr>
-                <w:p>
-                  <w:pPr>
-                    <w:rPr>
-                      <w:b/>
-                      <w:bCs/>
-                    </w:rPr>
-                  </w:pPr>
-                </w:p>
-              </w:tc>
+              <w:sdt>
+                <w:sdtPr>
+                  <w:id w:val="-1196623526"/>
+                  <w:placeholder>
+                    <w:docPart w:val="DefaultPlaceholder_-1854013440"/>
+                  </w:placeholder>
+                  <w:dataBinding w:prefixMappings="xmlns:ns0='urn:microsoft-dynamics-nav/reports/FS_Receivable_PaymentReceipt/50114/' " w:xpath="/ns0:NavWordReportXmlPart[1]/ns0:FinalSettlement[1]/ns0:Invoice_ID[1]" w:storeItemID="{097411A5-7817-4F41-BE2B-2CFDAB2FA0CA}"/>
+                  <w:text/>
+                </w:sdtPr>
+                <w:sdtContent>
+                  <w:tc>
+                    <w:tcPr>
+                      <w:tcW w:w="3114" w:type="dxa"/>
+                      <w:shd w:val="clear" w:color="auto" w:fill="auto"/>
+                    </w:tcPr>
+                    <w:p>
+                      <w:pPr>
+                        <w:rPr>
+                          <w:b/>
+                          <w:bCs/>
+                        </w:rPr>
+                      </w:pPr>
+                      <w:proofErr w:type="spellStart"/>
+                      <w:r>
+                        <w:t>Invoice_ID</w:t>
+                      </w:r>
+                      <w:proofErr w:type="spellEnd"/>
+                    </w:p>
+                  </w:tc>
+                </w:sdtContent>
+              </w:sdt>
               <w:tc>
                 <w:tcPr>
                   <w:tcW w:w="3118" w:type="dxa"/>
@@ -1156,14 +1173,14 @@
               </w:tc>
               <w:sdt>
                 <w:sdtPr>
+                  <w:alias w:val="#Nav: /FinalSettlement/Payment_mode"/>
+                  <w:tag w:val="#Nav: FS_Receivable_PaymentReceipt/50114"/>
                   <w:id w:val="283770026"/>
                   <w:placeholder>
                     <w:docPart w:val="DefaultPlaceholder_-1854013440"/>
                   </w:placeholder>
                   <w:dataBinding w:prefixMappings="xmlns:ns0='urn:microsoft-dynamics-nav/reports/FS_Receivable_PaymentReceipt/50114/'" w:xpath="/ns0:NavWordReportXmlPart[1]/ns0:FinalSettlement[1]/ns0:Payment_mode[1]" w:storeItemID="{097411A5-7817-4F41-BE2B-2CFDAB2FA0CA}"/>
                   <w:text/>
-                  <w:alias w:val="#Nav: /FinalSettlement/Payment_mode"/>
-                  <w:tag w:val="#Nav: FS_Receivable_PaymentReceipt/50114"/>
                 </w:sdtPr>
                 <w:sdtContent>
                   <w:tc>
@@ -1183,14 +1200,14 @@
               </w:sdt>
               <w:sdt>
                 <w:sdtPr>
+                  <w:alias w:val="#Nav: /FinalSettlement/Cheque_No_"/>
+                  <w:tag w:val="#Nav: FS_Receivable_PaymentReceipt/50114"/>
                   <w:id w:val="-642585388"/>
                   <w:placeholder>
                     <w:docPart w:val="DefaultPlaceholder_-1854013440"/>
                   </w:placeholder>
                   <w:dataBinding w:prefixMappings="xmlns:ns0='urn:microsoft-dynamics-nav/reports/FS_Receivable_PaymentReceipt/50114/'" w:xpath="/ns0:NavWordReportXmlPart[1]/ns0:FinalSettlement[1]/ns0:Cheque_No_[1]" w:storeItemID="{097411A5-7817-4F41-BE2B-2CFDAB2FA0CA}"/>
                   <w:text/>
-                  <w:alias w:val="#Nav: /FinalSettlement/Cheque_No_"/>
-                  <w:tag w:val="#Nav: FS_Receivable_PaymentReceipt/50114"/>
                 </w:sdtPr>
                 <w:sdtContent>
                   <w:tc>
@@ -1213,14 +1230,14 @@
               </w:sdt>
               <w:sdt>
                 <w:sdtPr>
+                  <w:alias w:val="#Nav: /FinalSettlement/Total_Amount"/>
+                  <w:tag w:val="#Nav: FS_Receivable_PaymentReceipt/50114"/>
                   <w:id w:val="789866209"/>
                   <w:placeholder>
                     <w:docPart w:val="DefaultPlaceholder_-1854013440"/>
                   </w:placeholder>
                   <w:dataBinding w:prefixMappings="xmlns:ns0='urn:microsoft-dynamics-nav/reports/FS_Receivable_PaymentReceipt/50114/'" w:xpath="/ns0:NavWordReportXmlPart[1]/ns0:FinalSettlement[1]/ns0:Total_Amount[1]" w:storeItemID="{097411A5-7817-4F41-BE2B-2CFDAB2FA0CA}"/>
                   <w:text/>
-                  <w:alias w:val="#Nav: /FinalSettlement/Total_Amount"/>
-                  <w:tag w:val="#Nav: FS_Receivable_PaymentReceipt/50114"/>
                 </w:sdtPr>
                 <w:sdtContent>
                   <w:tc>
@@ -1248,7 +1265,7 @@
                   <w:tcW w:w="13036" w:type="dxa"/>
                   <w:gridSpan w:val="5"/>
                   <w:tcBorders>
-                    <w:bottom w:val="single" w:color="auto" w:sz="4" w:space="0"/>
+                    <w:bottom w:val="single" w:sz="4" w:space="0" w:color="auto"/>
                   </w:tcBorders>
                 </w:tcPr>
                 <w:p>
@@ -1868,6 +1885,7 @@
     <w:rsid w:val="001831DA"/>
     <w:rsid w:val="001E7FF6"/>
     <w:rsid w:val="001F2457"/>
+    <w:rsid w:val="00311E99"/>
     <w:rsid w:val="00493F36"/>
     <w:rsid w:val="00551C0B"/>
     <w:rsid w:val="006223D6"/>
@@ -1875,6 +1893,7 @@
     <w:rsid w:val="008A5FEE"/>
     <w:rsid w:val="009F0A28"/>
     <w:rsid w:val="00A027F4"/>
+    <w:rsid w:val="00B50C63"/>
     <w:rsid w:val="00BF4D14"/>
     <w:rsid w:val="00C70B6D"/>
     <w:rsid w:val="00D101EE"/>
@@ -2675,6 +2694,8 @@
  
          < C u r r e n t D a t e > C u r r e n t D a t e < / C u r r e n t D a t e >   
+         < I n v o i c e _ I D > I n v o i c e _ I D < / I n v o i c e _ I D > + 
          < P a y m e n t _ m o d e > P a y m e n t _ m o d e < / P a y m e n t _ m o d e >   
          < T o t a l _ A m o u n t > T o t a l _ A m o u n t < / T o t a l _ A m o u n t > 
</xml_diff>

<commit_message>
Added a changes in fs payment receipt
</commit_message>
<xml_diff>
--- a/FS_Receivable_PaymentReceipt.docx
+++ b/FS_Receivable_PaymentReceipt.docx
@@ -1,6 +1,6 @@
 
 <file path=word/document.xml><?xml version="1.0" encoding="utf-8"?>
-<w:document xmlns:wpc="http://schemas.microsoft.com/office/word/2010/wordprocessingCanvas" xmlns:cx="http://schemas.microsoft.com/office/drawing/2014/chartex" xmlns:cx1="http://schemas.microsoft.com/office/drawing/2015/9/8/chartex" xmlns:cx2="http://schemas.microsoft.com/office/drawing/2015/10/21/chartex" xmlns:cx3="http://schemas.microsoft.com/office/drawing/2016/5/9/chartex" xmlns:cx4="http://schemas.microsoft.com/office/drawing/2016/5/10/chartex" xmlns:cx5="http://schemas.microsoft.com/office/drawing/2016/5/11/chartex" xmlns:cx6="http://schemas.microsoft.com/office/drawing/2016/5/12/chartex" xmlns:cx7="http://schemas.microsoft.com/office/drawing/2016/5/13/chartex" xmlns:cx8="http://schemas.microsoft.com/office/drawing/2016/5/14/chartex" xmlns:mc="http://schemas.openxmlformats.org/markup-compatibility/2006" xmlns:aink="http://schemas.microsoft.com/office/drawing/2016/ink" xmlns:am3d="http://schemas.microsoft.com/office/drawing/2017/model3d" xmlns:o="urn:schemas-microsoft-com:office:office" xmlns:oel="http://schemas.microsoft.com/office/2019/extlst" xmlns:r="http://schemas.openxmlformats.org/officeDocument/2006/relationships" xmlns:m="http://schemas.openxmlformats.org/officeDocument/2006/math" xmlns:v="urn:schemas-microsoft-com:vml" xmlns:wp14="http://schemas.microsoft.com/office/word/2010/wordprocessingDrawing" xmlns:wp="http://schemas.openxmlformats.org/drawingml/2006/wordprocessingDrawing" xmlns:w10="urn:schemas-microsoft-com:office:word" xmlns:w="http://schemas.openxmlformats.org/wordprocessingml/2006/main" xmlns:w14="http://schemas.microsoft.com/office/word/2010/wordml" xmlns:w15="http://schemas.microsoft.com/office/word/2012/wordml" xmlns:w16cex="http://schemas.microsoft.com/office/word/2018/wordml/cex" xmlns:w16cid="http://schemas.microsoft.com/office/word/2016/wordml/cid" xmlns:w16="http://schemas.microsoft.com/office/word/2018/wordml" xmlns:w16du="http://schemas.microsoft.com/office/word/2023/wordml/word16du" xmlns:w16sdtdh="http://schemas.microsoft.com/office/word/2020/wordml/sdtdatahash" xmlns:w16se="http://schemas.microsoft.com/office/word/2015/wordml/symex" xmlns:wpg="http://schemas.microsoft.com/office/word/2010/wordprocessingGroup" xmlns:wpi="http://schemas.microsoft.com/office/word/2010/wordprocessingInk" xmlns:wne="http://schemas.microsoft.com/office/word/2006/wordml" xmlns:wps="http://schemas.microsoft.com/office/word/2010/wordprocessingShape" mc:Ignorable="w14 w15 w16se w16cid w16 w16cex w16sdtdh w16du wp14">
+<w:document xmlns:a="http://schemas.openxmlformats.org/drawingml/2006/main" xmlns:pic="http://schemas.openxmlformats.org/drawingml/2006/picture" xmlns:wpc="http://schemas.microsoft.com/office/word/2010/wordprocessingCanvas" xmlns:cx="http://schemas.microsoft.com/office/drawing/2014/chartex" xmlns:cx1="http://schemas.microsoft.com/office/drawing/2015/9/8/chartex" xmlns:cx2="http://schemas.microsoft.com/office/drawing/2015/10/21/chartex" xmlns:cx3="http://schemas.microsoft.com/office/drawing/2016/5/9/chartex" xmlns:cx4="http://schemas.microsoft.com/office/drawing/2016/5/10/chartex" xmlns:cx5="http://schemas.microsoft.com/office/drawing/2016/5/11/chartex" xmlns:cx6="http://schemas.microsoft.com/office/drawing/2016/5/12/chartex" xmlns:cx7="http://schemas.microsoft.com/office/drawing/2016/5/13/chartex" xmlns:cx8="http://schemas.microsoft.com/office/drawing/2016/5/14/chartex" xmlns:mc="http://schemas.openxmlformats.org/markup-compatibility/2006" xmlns:aink="http://schemas.microsoft.com/office/drawing/2016/ink" xmlns:am3d="http://schemas.microsoft.com/office/drawing/2017/model3d" xmlns:o="urn:schemas-microsoft-com:office:office" xmlns:oel="http://schemas.microsoft.com/office/2019/extlst" xmlns:r="http://schemas.openxmlformats.org/officeDocument/2006/relationships" xmlns:m="http://schemas.openxmlformats.org/officeDocument/2006/math" xmlns:v="urn:schemas-microsoft-com:vml" xmlns:wp14="http://schemas.microsoft.com/office/word/2010/wordprocessingDrawing" xmlns:wp="http://schemas.openxmlformats.org/drawingml/2006/wordprocessingDrawing" xmlns:w10="urn:schemas-microsoft-com:office:word" xmlns:w="http://schemas.openxmlformats.org/wordprocessingml/2006/main" xmlns:w14="http://schemas.microsoft.com/office/word/2010/wordml" xmlns:w15="http://schemas.microsoft.com/office/word/2012/wordml" xmlns:w16cex="http://schemas.microsoft.com/office/word/2018/wordml/cex" xmlns:w16cid="http://schemas.microsoft.com/office/word/2016/wordml/cid" xmlns:w16="http://schemas.microsoft.com/office/word/2018/wordml" xmlns:w16du="http://schemas.microsoft.com/office/word/2023/wordml/word16du" xmlns:w16sdtdh="http://schemas.microsoft.com/office/word/2020/wordml/sdtdatahash" xmlns:w16se="http://schemas.microsoft.com/office/word/2015/wordml/symex" xmlns:wpg="http://schemas.microsoft.com/office/word/2010/wordprocessingGroup" xmlns:wpi="http://schemas.microsoft.com/office/word/2010/wordprocessingInk" xmlns:wne="http://schemas.microsoft.com/office/word/2006/wordml" xmlns:wps="http://schemas.microsoft.com/office/word/2010/wordprocessingShape" mc:Ignorable="w14 w15 w16se w16cid w16 w16cex w16sdtdh w16du wp14">
   <w:body>
     <w:tbl>
       <w:tblPr>
@@ -21,10 +21,10 @@
           <w:tcPr>
             <w:tcW w:w="13466" w:type="dxa"/>
             <w:tcBorders>
-              <w:top w:val="single" w:sz="12" w:space="0" w:color="auto"/>
-              <w:left w:val="single" w:sz="12" w:space="0" w:color="auto"/>
-              <w:bottom w:val="single" w:sz="12" w:space="0" w:color="auto"/>
-              <w:right w:val="single" w:sz="12" w:space="0" w:color="auto"/>
+              <w:top w:val="single" w:color="auto" w:sz="12" w:space="0"/>
+              <w:left w:val="single" w:color="auto" w:sz="12" w:space="0"/>
+              <w:bottom w:val="single" w:color="auto" w:sz="12" w:space="0"/>
+              <w:right w:val="single" w:color="auto" w:sz="12" w:space="0"/>
             </w:tcBorders>
           </w:tcPr>
           <w:tbl>
@@ -172,7 +172,7 @@
                         <w:top w:val="nil"/>
                         <w:left w:val="nil"/>
                         <w:bottom w:val="nil"/>
-                        <w:right w:val="single" w:sz="4" w:space="0" w:color="auto"/>
+                        <w:right w:val="single" w:color="auto" w:sz="4" w:space="0"/>
                       </w:tcBorders>
                     </w:tcPr>
                     <w:p>
@@ -185,8 +185,8 @@
                         </w:rPr>
                         <w:drawing>
                           <wp:inline distT="0" distB="0" distL="0" distR="0" wp14:anchorId="6B5B9CA2" wp14:editId="7CEA949C">
-                            <wp:extent cx="2773680" cy="891540"/>
-                            <wp:effectExtent l="0" t="0" r="7620" b="3810"/>
+                            <wp:extent cx="891540" cy="891540"/>
+                            <wp:effectExtent l="0" t="0" r="3810" b="3810"/>
                             <wp:docPr id="1" name="Picture 1"/>
                             <wp:cNvGraphicFramePr>
                               <a:graphicFrameLocks xmlns:a="http://schemas.openxmlformats.org/drawingml/2006/main" noChangeAspect="1"/>
@@ -209,7 +209,7 @@
                                   <pic:spPr bwMode="auto">
                                     <a:xfrm>
                                       <a:off x="0" y="0"/>
-                                      <a:ext cx="2773680" cy="891540"/>
+                                      <a:ext cx="891540" cy="891540"/>
                                     </a:xfrm>
                                     <a:prstGeom prst="rect">
                                       <a:avLst/>
@@ -314,7 +314,7 @@
                     <w:top w:val="nil"/>
                     <w:left w:val="nil"/>
                     <w:bottom w:val="nil"/>
-                    <w:right w:val="single" w:sz="4" w:space="0" w:color="auto"/>
+                    <w:right w:val="single" w:color="auto" w:sz="4" w:space="0"/>
                   </w:tcBorders>
                 </w:tcPr>
                 <w:p/>
@@ -365,7 +365,7 @@
                     <w:top w:val="nil"/>
                     <w:left w:val="nil"/>
                     <w:bottom w:val="nil"/>
-                    <w:right w:val="single" w:sz="4" w:space="0" w:color="auto"/>
+                    <w:right w:val="single" w:color="auto" w:sz="4" w:space="0"/>
                   </w:tcBorders>
                 </w:tcPr>
                 <w:p/>
@@ -416,7 +416,7 @@
                     <w:top w:val="nil"/>
                     <w:left w:val="nil"/>
                     <w:bottom w:val="nil"/>
-                    <w:right w:val="single" w:sz="4" w:space="0" w:color="auto"/>
+                    <w:right w:val="single" w:color="auto" w:sz="4" w:space="0"/>
                   </w:tcBorders>
                 </w:tcPr>
                 <w:p/>
@@ -470,7 +470,7 @@
                     <w:top w:val="nil"/>
                     <w:left w:val="nil"/>
                     <w:bottom w:val="nil"/>
-                    <w:right w:val="single" w:sz="4" w:space="0" w:color="auto"/>
+                    <w:right w:val="single" w:color="auto" w:sz="4" w:space="0"/>
                   </w:tcBorders>
                 </w:tcPr>
                 <w:p/>
@@ -511,7 +511,7 @@
                   <w:gridSpan w:val="5"/>
                   <w:tcBorders>
                     <w:top w:val="nil"/>
-                    <w:bottom w:val="single" w:sz="4" w:space="0" w:color="auto"/>
+                    <w:bottom w:val="single" w:color="auto" w:sz="4" w:space="0"/>
                   </w:tcBorders>
                 </w:tcPr>
                 <w:p>
@@ -1128,11 +1128,13 @@
               </w:trPr>
               <w:sdt>
                 <w:sdtPr>
+                  <w:alias w:val="#Nav: /FinalSettlement/Invoice_ID"/>
+                  <w:tag w:val="#Nav: FS_Receivable_PaymentReceipt/50114"/>
                   <w:id w:val="-1196623526"/>
                   <w:placeholder>
                     <w:docPart w:val="DefaultPlaceholder_-1854013440"/>
                   </w:placeholder>
-                  <w:dataBinding w:prefixMappings="xmlns:ns0='urn:microsoft-dynamics-nav/reports/FS_Receivable_PaymentReceipt/50114/' " w:xpath="/ns0:NavWordReportXmlPart[1]/ns0:FinalSettlement[1]/ns0:Invoice_ID[1]" w:storeItemID="{097411A5-7817-4F41-BE2B-2CFDAB2FA0CA}"/>
+                  <w:dataBinding w:prefixMappings="xmlns:ns0='urn:microsoft-dynamics-nav/reports/FS_Receivable_PaymentReceipt/50114/'" w:xpath="/ns0:NavWordReportXmlPart[1]/ns0:FinalSettlement[1]/ns0:Invoice_ID[1]" w:storeItemID="{097411A5-7817-4F41-BE2B-2CFDAB2FA0CA}"/>
                   <w:text/>
                 </w:sdtPr>
                 <w:sdtContent>
@@ -1265,7 +1267,7 @@
                   <w:tcW w:w="13036" w:type="dxa"/>
                   <w:gridSpan w:val="5"/>
                   <w:tcBorders>
-                    <w:bottom w:val="single" w:sz="4" w:space="0" w:color="auto"/>
+                    <w:bottom w:val="single" w:color="auto" w:sz="4" w:space="0"/>
                   </w:tcBorders>
                 </w:tcPr>
                 <w:p>
@@ -1285,14 +1287,14 @@
                 </w:p>
                 <w:sdt>
                   <w:sdtPr>
-                    <w:alias w:val="#Nav: /FinalCalculation/FinalSettlement/AmountInWords"/>
-                    <w:tag w:val="#Nav: FS_Receivable_PaymentReceipt/50114"/>
-                    <w:id w:val="1846895747"/>
+                    <w:id w:val="1551651119"/>
                     <w:placeholder>
                       <w:docPart w:val="DefaultPlaceholder_-1854013440"/>
                     </w:placeholder>
-                    <w:dataBinding w:prefixMappings="xmlns:ns0='urn:microsoft-dynamics-nav/reports/FS_Receivable_PaymentReceipt/50114/'" w:xpath="/ns0:NavWordReportXmlPart[1]/ns0:FinalCalculation[1]/ns0:FinalSettlement[1]/ns0:AmountInWords[1]" w:storeItemID="{097411A5-7817-4F41-BE2B-2CFDAB2FA0CA}"/>
+                    <w:dataBinding w:prefixMappings="xmlns:ns0='urn:microsoft-dynamics-nav/reports/FS_Receivable_PaymentReceipt/50114/'" w:xpath="/ns0:NavWordReportXmlPart[1]/ns0:FinalSettlement[1]/ns0:Final_Settlement_Words[1]" w:storeItemID="{097411A5-7817-4F41-BE2B-2CFDAB2FA0CA}"/>
                     <w:text/>
+                    <w:alias w:val="#Nav: /FinalSettlement/Final_Settlement_Words"/>
+                    <w:tag w:val="#Nav: FS_Receivable_PaymentReceipt/50114"/>
                   </w:sdtPr>
                   <w:sdtContent>
                     <w:p>
@@ -1304,7 +1306,7 @@
                       </w:pPr>
                       <w:proofErr w:type="spellStart"/>
                       <w:r>
-                        <w:t>AmountInWords</w:t>
+                        <w:t>Final_Settlement_Words</w:t>
                       </w:r>
                       <w:proofErr w:type="spellEnd"/>
                     </w:p>
@@ -1889,10 +1891,12 @@
     <w:rsid w:val="00493F36"/>
     <w:rsid w:val="00551C0B"/>
     <w:rsid w:val="006223D6"/>
+    <w:rsid w:val="0068795C"/>
     <w:rsid w:val="007C2514"/>
     <w:rsid w:val="008A5FEE"/>
     <w:rsid w:val="009F0A28"/>
     <w:rsid w:val="00A027F4"/>
+    <w:rsid w:val="00B15859"/>
     <w:rsid w:val="00B50C63"/>
     <w:rsid w:val="00BF4D14"/>
     <w:rsid w:val="00C70B6D"/>
@@ -2694,6 +2698,8 @@
  
          < C u r r e n t D a t e > C u r r e n t D a t e < / C u r r e n t D a t e >   
+         < F i n a l _ S e t t l e m e n t _ W o r d s > F i n a l _ S e t t l e m e n t _ W o r d s < / F i n a l _ S e t t l e m e n t _ W o r d s > + 
          < I n v o i c e _ I D > I n v o i c e _ I D < / I n v o i c e _ I D >   
          < P a y m e n t _ m o d e > P a y m e n t _ m o d e < / P a y m e n t _ m o d e > 
</xml_diff>

<commit_message>
Added tenant name field in fs payment receipt and made some changes
</commit_message>
<xml_diff>
--- a/FS_Receivable_PaymentReceipt.docx
+++ b/FS_Receivable_PaymentReceipt.docx
@@ -37,11 +37,11 @@
               <w:tblLook w:val="04A0" w:firstRow="1" w:lastRow="0" w:firstColumn="1" w:lastColumn="0" w:noHBand="0" w:noVBand="1"/>
             </w:tblPr>
             <w:tblGrid>
-              <w:gridCol w:w="3114"/>
-              <w:gridCol w:w="3118"/>
-              <w:gridCol w:w="2127"/>
-              <w:gridCol w:w="2693"/>
-              <w:gridCol w:w="1984"/>
+              <w:gridCol w:w="1838"/>
+              <w:gridCol w:w="4394"/>
+              <w:gridCol w:w="2268"/>
+              <w:gridCol w:w="2268"/>
+              <w:gridCol w:w="2268"/>
             </w:tblGrid>
             <w:tr>
               <w:trPr>
@@ -75,7 +75,6 @@
                       </w:tcBorders>
                     </w:tcPr>
                     <w:p>
-                      <w:proofErr w:type="spellStart"/>
                       <w:r>
                         <w:rPr>
                           <w:b/>
@@ -85,7 +84,6 @@
                         </w:rPr>
                         <w:t>CompanyName</w:t>
                       </w:r>
-                      <w:proofErr w:type="spellEnd"/>
                     </w:p>
                   </w:tc>
                 </w:sdtContent>
@@ -116,7 +114,7 @@
                       <w:sz w:val="36"/>
                       <w:szCs w:val="36"/>
                     </w:rPr>
-                    <w:t>Payment Receipt</w:t>
+                    <w:t>Final Settlement</w:t>
                   </w:r>
                 </w:p>
               </w:tc>
@@ -145,11 +143,9 @@
                       </w:tcBorders>
                     </w:tcPr>
                     <w:p>
-                      <w:proofErr w:type="spellStart"/>
                       <w:r>
                         <w:t>CompanyAddress</w:t>
                       </w:r>
-                      <w:proofErr w:type="spellEnd"/>
                     </w:p>
                   </w:tc>
                 </w:sdtContent>
@@ -184,9 +180,9 @@
                           <w:noProof/>
                         </w:rPr>
                         <w:drawing>
-                          <wp:inline distT="0" distB="0" distL="0" distR="0" wp14:anchorId="6B5B9CA2" wp14:editId="7CEA949C">
-                            <wp:extent cx="891540" cy="891540"/>
-                            <wp:effectExtent l="0" t="0" r="3810" b="3810"/>
+                          <wp:inline distT="0" distB="0" distL="0" distR="0" wp14:anchorId="6B5B9CA2" wp14:editId="5BCBC1BB">
+                            <wp:extent cx="2430780" cy="891540"/>
+                            <wp:effectExtent l="0" t="0" r="7620" b="3810"/>
                             <wp:docPr id="1" name="Picture 1"/>
                             <wp:cNvGraphicFramePr>
                               <a:graphicFrameLocks xmlns:a="http://schemas.openxmlformats.org/drawingml/2006/main" noChangeAspect="1"/>
@@ -209,7 +205,7 @@
                                   <pic:spPr bwMode="auto">
                                     <a:xfrm>
                                       <a:off x="0" y="0"/>
-                                      <a:ext cx="891540" cy="891540"/>
+                                      <a:ext cx="2430780" cy="891540"/>
                                     </a:xfrm>
                                     <a:prstGeom prst="rect">
                                       <a:avLst/>
@@ -254,7 +250,6 @@
                       <w:text/>
                     </w:sdtPr>
                     <w:sdtContent>
-                      <w:proofErr w:type="spellStart"/>
                       <w:r>
                         <w:t>CompanyCity</w:t>
                       </w:r>
@@ -278,13 +273,11 @@
                       <w:r>
                         <w:t>CompanyPostcode</w:t>
                       </w:r>
-                      <w:proofErr w:type="spellEnd"/>
                     </w:sdtContent>
                   </w:sdt>
                   <w:r>
                     <w:t xml:space="preserve"> ,</w:t>
                   </w:r>
-                  <w:proofErr w:type="spellStart"/>
                   <w:sdt>
                     <w:sdtPr>
                       <w:alias w:val="#Nav: /FinalSettlement/CompanyCountry"/>
@@ -300,7 +293,6 @@
                       <w:r>
                         <w:t>CompanyCountry</w:t>
                       </w:r>
-                      <w:proofErr w:type="spellEnd"/>
                     </w:sdtContent>
                   </w:sdt>
                 </w:p>
@@ -347,11 +339,9 @@
                       <w:text/>
                     </w:sdtPr>
                     <w:sdtContent>
-                      <w:proofErr w:type="spellStart"/>
                       <w:r>
                         <w:t>CompanyPhone</w:t>
                       </w:r>
-                      <w:proofErr w:type="spellEnd"/>
                     </w:sdtContent>
                   </w:sdt>
                 </w:p>
@@ -398,11 +388,9 @@
                       <w:text/>
                     </w:sdtPr>
                     <w:sdtContent>
-                      <w:proofErr w:type="spellStart"/>
                       <w:r>
                         <w:t>CompanyEmail</w:t>
                       </w:r>
-                      <w:proofErr w:type="spellEnd"/>
                     </w:sdtContent>
                   </w:sdt>
                 </w:p>
@@ -452,11 +440,9 @@
                       <w:text/>
                     </w:sdtPr>
                     <w:sdtContent>
-                      <w:proofErr w:type="spellStart"/>
                       <w:r>
                         <w:t>CompanyTRN</w:t>
                       </w:r>
-                      <w:proofErr w:type="spellEnd"/>
                     </w:sdtContent>
                   </w:sdt>
                 </w:p>
@@ -535,11 +521,9 @@
                       <w:text/>
                     </w:sdtPr>
                     <w:sdtContent>
-                      <w:proofErr w:type="spellStart"/>
                       <w:r>
                         <w:t>CurrentDate</w:t>
                       </w:r>
-                      <w:proofErr w:type="spellEnd"/>
                     </w:sdtContent>
                   </w:sdt>
                 </w:p>
@@ -659,11 +643,9 @@
                       <w:text/>
                     </w:sdtPr>
                     <w:sdtContent>
-                      <w:proofErr w:type="spellStart"/>
                       <w:r>
                         <w:t>Contract_ID</w:t>
                       </w:r>
-                      <w:proofErr w:type="spellEnd"/>
                     </w:sdtContent>
                   </w:sdt>
                 </w:p>
@@ -727,11 +709,9 @@
                       <w:text/>
                     </w:sdtPr>
                     <w:sdtContent>
-                      <w:proofErr w:type="spellStart"/>
                       <w:r>
                         <w:t>Property_Name</w:t>
                       </w:r>
-                      <w:proofErr w:type="spellEnd"/>
                     </w:sdtContent>
                   </w:sdt>
                 </w:p>
@@ -766,13 +746,8 @@
                       <w:text/>
                     </w:sdtPr>
                     <w:sdtContent>
-                      <w:proofErr w:type="spellStart"/>
                       <w:r>
-                        <w:t>Phone_No</w:t>
-                      </w:r>
-                      <w:proofErr w:type="spellEnd"/>
-                      <w:r>
-                        <w:t>_</w:t>
+                        <w:t>Phone_No_</w:t>
                       </w:r>
                     </w:sdtContent>
                   </w:sdt>
@@ -803,11 +778,9 @@
                       <w:text/>
                     </w:sdtPr>
                     <w:sdtContent>
-                      <w:proofErr w:type="spellStart"/>
                       <w:r>
                         <w:t>Unit_Name</w:t>
                       </w:r>
-                      <w:proofErr w:type="spellEnd"/>
                     </w:sdtContent>
                   </w:sdt>
                 </w:p>
@@ -842,11 +815,9 @@
                       <w:text/>
                     </w:sdtPr>
                     <w:sdtContent>
-                      <w:proofErr w:type="spellStart"/>
                       <w:r>
                         <w:t>E_Mail</w:t>
                       </w:r>
-                      <w:proofErr w:type="spellEnd"/>
                     </w:sdtContent>
                   </w:sdt>
                 </w:p>
@@ -876,11 +847,9 @@
                       <w:text/>
                     </w:sdtPr>
                     <w:sdtContent>
-                      <w:proofErr w:type="spellStart"/>
                       <w:r>
                         <w:t>Contract_Start_Date</w:t>
                       </w:r>
-                      <w:proofErr w:type="spellEnd"/>
                     </w:sdtContent>
                   </w:sdt>
                   <w:r>
@@ -901,11 +870,9 @@
                       <w:text/>
                     </w:sdtPr>
                     <w:sdtContent>
-                      <w:proofErr w:type="spellStart"/>
                       <w:r>
                         <w:t>Contract_End_Date</w:t>
                       </w:r>
-                      <w:proofErr w:type="spellEnd"/>
                     </w:sdtContent>
                   </w:sdt>
                 </w:p>
@@ -939,13 +906,8 @@
                       <w:text/>
                     </w:sdtPr>
                     <w:sdtContent>
-                      <w:proofErr w:type="spellStart"/>
                       <w:r>
-                        <w:t>VAT_Registration_No</w:t>
-                      </w:r>
-                      <w:proofErr w:type="spellEnd"/>
-                      <w:r>
-                        <w:t>_</w:t>
+                        <w:t>VAT_Registration_No_</w:t>
                       </w:r>
                     </w:sdtContent>
                   </w:sdt>
@@ -975,11 +937,9 @@
                       <w:text/>
                     </w:sdtPr>
                     <w:sdtContent>
-                      <w:proofErr w:type="spellStart"/>
                       <w:r>
                         <w:t>Contract_Tenor</w:t>
                       </w:r>
-                      <w:proofErr w:type="spellEnd"/>
                     </w:sdtContent>
                   </w:sdt>
                 </w:p>
@@ -1018,7 +978,7 @@
               </w:trPr>
               <w:tc>
                 <w:tcPr>
-                  <w:tcW w:w="3114" w:type="dxa"/>
+                  <w:tcW w:w="1838" w:type="dxa"/>
                   <w:shd w:val="clear" w:color="auto" w:fill="00B0F0"/>
                 </w:tcPr>
                 <w:p>
@@ -1039,7 +999,7 @@
               </w:tc>
               <w:tc>
                 <w:tcPr>
-                  <w:tcW w:w="3118" w:type="dxa"/>
+                  <w:tcW w:w="4394" w:type="dxa"/>
                   <w:shd w:val="clear" w:color="auto" w:fill="00B0F0"/>
                 </w:tcPr>
                 <w:p>
@@ -1060,7 +1020,7 @@
               </w:tc>
               <w:tc>
                 <w:tcPr>
-                  <w:tcW w:w="2127" w:type="dxa"/>
+                  <w:tcW w:w="2268" w:type="dxa"/>
                   <w:shd w:val="clear" w:color="auto" w:fill="00B0F0"/>
                 </w:tcPr>
                 <w:p>
@@ -1081,7 +1041,7 @@
               </w:tc>
               <w:tc>
                 <w:tcPr>
-                  <w:tcW w:w="2693" w:type="dxa"/>
+                  <w:tcW w:w="2268" w:type="dxa"/>
                   <w:shd w:val="clear" w:color="auto" w:fill="00B0F0"/>
                 </w:tcPr>
                 <w:p>
@@ -1102,7 +1062,7 @@
               </w:tc>
               <w:tc>
                 <w:tcPr>
-                  <w:tcW w:w="1984" w:type="dxa"/>
+                  <w:tcW w:w="2268" w:type="dxa"/>
                   <w:shd w:val="clear" w:color="auto" w:fill="00B0F0"/>
                 </w:tcPr>
                 <w:p>
@@ -1140,7 +1100,7 @@
                 <w:sdtContent>
                   <w:tc>
                     <w:tcPr>
-                      <w:tcW w:w="3114" w:type="dxa"/>
+                      <w:tcW w:w="1838" w:type="dxa"/>
                       <w:shd w:val="clear" w:color="auto" w:fill="auto"/>
                     </w:tcPr>
                     <w:p>
@@ -1150,27 +1110,85 @@
                           <w:bCs/>
                         </w:rPr>
                       </w:pPr>
-                      <w:proofErr w:type="spellStart"/>
                       <w:r>
                         <w:t>Invoice_ID</w:t>
                       </w:r>
-                      <w:proofErr w:type="spellEnd"/>
                     </w:p>
                   </w:tc>
                 </w:sdtContent>
               </w:sdt>
               <w:tc>
                 <w:tcPr>
-                  <w:tcW w:w="3118" w:type="dxa"/>
+                  <w:tcW w:w="4394" w:type="dxa"/>
                   <w:shd w:val="clear" w:color="auto" w:fill="auto"/>
                 </w:tcPr>
                 <w:p>
-                  <w:r>
-                    <w:t>Receivable</w:t>
-                  </w:r>
-                  <w:r>
-                    <w:t xml:space="preserve"> Amount</w:t>
-                  </w:r>
+                  <w:pPr>
+                    <w:rPr>
+                      <w:sz w:val="24"/>
+                      <w:szCs w:val="24"/>
+                    </w:rPr>
+                  </w:pPr>
+                  <w:r>
+                    <w:rPr>
+                      <w:sz w:val="24"/>
+                      <w:szCs w:val="24"/>
+                    </w:rPr>
+                    <w:t>Final Settlement</w:t>
+                  </w:r>
+                  <w:r>
+                    <w:rPr>
+                      <w:sz w:val="24"/>
+                      <w:szCs w:val="24"/>
+                    </w:rPr>
+                    <w:t xml:space="preserve"> </w:t>
+                  </w:r>
+                  <w:r>
+                    <w:rPr>
+                      <w:sz w:val="24"/>
+                      <w:szCs w:val="24"/>
+                    </w:rPr>
+                    <w:t xml:space="preserve">– </w:t>
+                  </w:r>
+                  <w:r>
+                    <w:rPr>
+                      <w:sz w:val="24"/>
+                      <w:szCs w:val="24"/>
+                    </w:rPr>
+                    <w:t>Contract</w:t>
+                  </w:r>
+                  <w:r>
+                    <w:rPr>
+                      <w:sz w:val="24"/>
+                      <w:szCs w:val="24"/>
+                    </w:rPr>
+                    <w:t xml:space="preserve"> </w:t>
+                  </w:r>
+                  <w:sdt>
+                    <w:sdtPr>
+                      <w:rPr>
+                        <w:sz w:val="24"/>
+                        <w:szCs w:val="24"/>
+                      </w:rPr>
+                      <w:id w:val="-1501491100"/>
+                      <w:placeholder>
+                        <w:docPart w:val="DefaultPlaceholder_-1854013440"/>
+                      </w:placeholder>
+                      <w:dataBinding w:prefixMappings="xmlns:ns0='urn:microsoft-dynamics-nav/reports/FS_Receivable_PaymentReceipt/50114/'" w:xpath="/ns0:NavWordReportXmlPart[1]/ns0:FinalSettlement[1]/ns0:Contract_ID[1]" w:storeItemID="{097411A5-7817-4F41-BE2B-2CFDAB2FA0CA}"/>
+                      <w:text/>
+                      <w:alias w:val="#Nav: /FinalSettlement/Contract_ID"/>
+                      <w:tag w:val="#Nav: FS_Receivable_PaymentReceipt/50114"/>
+                    </w:sdtPr>
+                    <w:sdtContent>
+                      <w:r>
+                        <w:rPr>
+                          <w:sz w:val="24"/>
+                          <w:szCs w:val="24"/>
+                        </w:rPr>
+                        <w:t>Contract_ID</w:t>
+                      </w:r>
+                    </w:sdtContent>
+                  </w:sdt>
                 </w:p>
               </w:tc>
               <w:sdt>
@@ -1187,15 +1205,13 @@
                 <w:sdtContent>
                   <w:tc>
                     <w:tcPr>
-                      <w:tcW w:w="2127" w:type="dxa"/>
+                      <w:tcW w:w="2268" w:type="dxa"/>
                       <w:shd w:val="clear" w:color="auto" w:fill="auto"/>
                     </w:tcPr>
                     <w:p>
-                      <w:proofErr w:type="spellStart"/>
                       <w:r>
                         <w:t>Payment_mode</w:t>
                       </w:r>
-                      <w:proofErr w:type="spellEnd"/>
                     </w:p>
                   </w:tc>
                 </w:sdtContent>
@@ -1214,17 +1230,12 @@
                 <w:sdtContent>
                   <w:tc>
                     <w:tcPr>
-                      <w:tcW w:w="2693" w:type="dxa"/>
+                      <w:tcW w:w="2268" w:type="dxa"/>
                       <w:shd w:val="clear" w:color="auto" w:fill="auto"/>
                     </w:tcPr>
                     <w:p>
-                      <w:proofErr w:type="spellStart"/>
                       <w:r>
-                        <w:t>Cheque_No</w:t>
-                      </w:r>
-                      <w:proofErr w:type="spellEnd"/>
-                      <w:r>
-                        <w:t>_</w:t>
+                        <w:t>Cheque_No_</w:t>
                       </w:r>
                     </w:p>
                   </w:tc>
@@ -1244,15 +1255,13 @@
                 <w:sdtContent>
                   <w:tc>
                     <w:tcPr>
-                      <w:tcW w:w="1984" w:type="dxa"/>
+                      <w:tcW w:w="2268" w:type="dxa"/>
                       <w:shd w:val="clear" w:color="auto" w:fill="auto"/>
                     </w:tcPr>
                     <w:p>
-                      <w:proofErr w:type="spellStart"/>
                       <w:r>
                         <w:t>Total_Amount</w:t>
                       </w:r>
-                      <w:proofErr w:type="spellEnd"/>
                     </w:p>
                   </w:tc>
                 </w:sdtContent>
@@ -1287,14 +1296,14 @@
                 </w:p>
                 <w:sdt>
                   <w:sdtPr>
+                    <w:alias w:val="#Nav: /FinalSettlement/Final_Settlement_Words"/>
+                    <w:tag w:val="#Nav: FS_Receivable_PaymentReceipt/50114"/>
                     <w:id w:val="1551651119"/>
                     <w:placeholder>
                       <w:docPart w:val="DefaultPlaceholder_-1854013440"/>
                     </w:placeholder>
                     <w:dataBinding w:prefixMappings="xmlns:ns0='urn:microsoft-dynamics-nav/reports/FS_Receivable_PaymentReceipt/50114/'" w:xpath="/ns0:NavWordReportXmlPart[1]/ns0:FinalSettlement[1]/ns0:Final_Settlement_Words[1]" w:storeItemID="{097411A5-7817-4F41-BE2B-2CFDAB2FA0CA}"/>
                     <w:text/>
-                    <w:alias w:val="#Nav: /FinalSettlement/Final_Settlement_Words"/>
-                    <w:tag w:val="#Nav: FS_Receivable_PaymentReceipt/50114"/>
                   </w:sdtPr>
                   <w:sdtContent>
                     <w:p>
@@ -1304,11 +1313,9 @@
                           <w:bCs/>
                         </w:rPr>
                       </w:pPr>
-                      <w:proofErr w:type="spellStart"/>
                       <w:r>
                         <w:t>Final_Settlement_Words</w:t>
                       </w:r>
-                      <w:proofErr w:type="spellEnd"/>
                     </w:p>
                   </w:sdtContent>
                 </w:sdt>
@@ -1752,7 +1759,6 @@
   <w:style w:type="character" w:default="1" w:styleId="DefaultParagraphFont">
     <w:name w:val="Default Paragraph Font"/>
     <w:uiPriority w:val="1"/>
-    <w:semiHidden/>
     <w:unhideWhenUsed/>
   </w:style>
   <w:style w:type="table" w:default="1" w:styleId="TableNormal">
@@ -1887,13 +1893,19 @@
     <w:rsid w:val="001831DA"/>
     <w:rsid w:val="001E7FF6"/>
     <w:rsid w:val="001F2457"/>
+    <w:rsid w:val="00277831"/>
     <w:rsid w:val="00311E99"/>
+    <w:rsid w:val="00390782"/>
+    <w:rsid w:val="003F2665"/>
     <w:rsid w:val="00493F36"/>
     <w:rsid w:val="00551C0B"/>
     <w:rsid w:val="006223D6"/>
     <w:rsid w:val="0068795C"/>
     <w:rsid w:val="007C2514"/>
+    <w:rsid w:val="00843B89"/>
+    <w:rsid w:val="00845F50"/>
     <w:rsid w:val="008A5FEE"/>
+    <w:rsid w:val="00900E68"/>
     <w:rsid w:val="009F0A28"/>
     <w:rsid w:val="00A027F4"/>
     <w:rsid w:val="00B15859"/>
@@ -1904,6 +1916,8 @@
     <w:rsid w:val="00D417EA"/>
     <w:rsid w:val="00E913E8"/>
     <w:rsid w:val="00EA3C6A"/>
+    <w:rsid w:val="00ED65C5"/>
+    <w:rsid w:val="00F55ECA"/>
     <w:rsid w:val="00F84E86"/>
   </w:rsids>
   <m:mathPr>

</xml_diff>